<commit_message>
vault backup: 2026-05-06 21:09:08
</commit_message>
<xml_diff>
--- a/学校事务/大数据/课程总结/《大数据处理与实践》课程总结_提交版.docx
+++ b/学校事务/大数据/课程总结/《大数据处理与实践》课程总结_提交版.docx
@@ -8,7 +8,7 @@
     <w:p/>
     <w:p>
       <w:pPr>
-        <w:spacing w:after="240"/>
+        <w:spacing w:after="0"/>
         <w:jc w:val="center"/>
       </w:pPr>
       <w:r>
@@ -17,12 +17,19 @@
           <w:b/>
           <w:sz w:val="36"/>
         </w:rPr>
+      </w:r>
+      <w:r>
+        <w:rPr>
+          <w:rFonts w:ascii="宋体" w:hAnsi="宋体" w:eastAsia="宋体"/>
+          <w:b/>
+          <w:sz w:val="44"/>
+        </w:rPr>
         <w:t>《大数据处理与实践》</w:t>
       </w:r>
     </w:p>
     <w:p>
       <w:pPr>
-        <w:spacing w:after="960"/>
+        <w:spacing w:after="0"/>
         <w:jc w:val="center"/>
       </w:pPr>
       <w:r>
@@ -31,7 +38,14 @@
           <w:b/>
           <w:sz w:val="44"/>
         </w:rPr>
-        <w:t>课程总结与心得</w:t>
+      </w:r>
+      <w:r>
+        <w:rPr>
+          <w:rFonts w:ascii="宋体" w:hAnsi="宋体" w:eastAsia="宋体"/>
+          <w:b/>
+          <w:sz w:val="44"/>
+        </w:rPr>
+        <w:t>课程总结</w:t>
       </w:r>
     </w:p>
     <w:p/>
@@ -43,6 +57,14 @@
         <w:tblW w:type="auto" w:w="0"/>
         <w:jc w:val="center"/>
         <w:tblLook w:firstColumn="1" w:firstRow="1" w:lastColumn="0" w:lastRow="0" w:noHBand="0" w:noVBand="1" w:val="04A0"/>
+        <w:tblBorders>
+          <w:top w:val="nil"/>
+          <w:left w:val="nil"/>
+          <w:bottom w:val="nil"/>
+          <w:right w:val="nil"/>
+          <w:insideH w:val="nil"/>
+          <w:insideV w:val="nil"/>
+        </w:tblBorders>
       </w:tblPr>
       <w:tblGrid>
         <w:gridCol w:w="4365"/>
@@ -50,63 +72,18 @@
       </w:tblGrid>
       <w:tr>
         <w:trPr>
-          <w:trHeight w:val="624"/>
+          <w:trHeight w:val="539"/>
         </w:trPr>
         <w:tc>
           <w:tcPr>
-            <w:tcW w:type="dxa" w:w="2268"/>
+            <w:tcW w:type="dxa" w:w="1701"/>
             <w:vAlign w:val="center"/>
             <w:shd w:fill="F2F2F2"/>
           </w:tcPr>
           <w:p>
             <w:pPr>
-              <w:jc w:val="center"/>
-            </w:pPr>
-            <w:r/>
-            <w:r>
-              <w:rPr>
-                <w:rFonts w:ascii="宋体" w:hAnsi="宋体" w:eastAsia="宋体"/>
-                <w:b/>
-                <w:sz w:val="24"/>
-              </w:rPr>
-              <w:t>课程名称</w:t>
-            </w:r>
-          </w:p>
-        </w:tc>
-        <w:tc>
-          <w:tcPr>
-            <w:tcW w:type="dxa" w:w="4819"/>
-            <w:vAlign w:val="center"/>
-          </w:tcPr>
-          <w:p>
-            <w:pPr>
-              <w:jc w:val="center"/>
-            </w:pPr>
-            <w:r/>
-            <w:r>
-              <w:rPr>
-                <w:rFonts w:ascii="宋体" w:hAnsi="宋体" w:eastAsia="宋体"/>
-                <w:b w:val="0"/>
-                <w:sz w:val="24"/>
-              </w:rPr>
-              <w:t>大数据处理与实践</w:t>
-            </w:r>
-          </w:p>
-        </w:tc>
-      </w:tr>
-      <w:tr>
-        <w:trPr>
-          <w:trHeight w:val="624"/>
-        </w:trPr>
-        <w:tc>
-          <w:tcPr>
-            <w:tcW w:type="dxa" w:w="2268"/>
-            <w:vAlign w:val="center"/>
-            <w:shd w:fill="F2F2F2"/>
-          </w:tcPr>
-          <w:p>
-            <w:pPr>
-              <w:jc w:val="center"/>
+              <w:spacing w:after="0" w:line="360" w:lineRule="auto"/>
+              <w:jc w:val="left"/>
             </w:pPr>
             <w:r/>
             <w:r>
@@ -126,7 +103,8 @@
           </w:tcPr>
           <w:p>
             <w:pPr>
-              <w:jc w:val="center"/>
+              <w:spacing w:after="0" w:line="360" w:lineRule="auto"/>
+              <w:jc w:val="left"/>
             </w:pPr>
             <w:r/>
             <w:r>
@@ -142,17 +120,18 @@
       </w:tr>
       <w:tr>
         <w:trPr>
-          <w:trHeight w:val="624"/>
+          <w:trHeight w:val="539"/>
         </w:trPr>
         <w:tc>
           <w:tcPr>
-            <w:tcW w:type="dxa" w:w="2268"/>
+            <w:tcW w:type="dxa" w:w="1701"/>
             <w:vAlign w:val="center"/>
             <w:shd w:fill="F2F2F2"/>
           </w:tcPr>
           <w:p>
             <w:pPr>
-              <w:jc w:val="center"/>
+              <w:spacing w:after="0" w:line="360" w:lineRule="auto"/>
+              <w:jc w:val="left"/>
             </w:pPr>
             <w:r/>
             <w:r>
@@ -172,7 +151,8 @@
           </w:tcPr>
           <w:p>
             <w:pPr>
-              <w:jc w:val="center"/>
+              <w:spacing w:after="0" w:line="360" w:lineRule="auto"/>
+              <w:jc w:val="left"/>
             </w:pPr>
             <w:r/>
             <w:r>
@@ -188,17 +168,18 @@
       </w:tr>
       <w:tr>
         <w:trPr>
-          <w:trHeight w:val="624"/>
+          <w:trHeight w:val="539"/>
         </w:trPr>
         <w:tc>
           <w:tcPr>
-            <w:tcW w:type="dxa" w:w="2268"/>
+            <w:tcW w:type="dxa" w:w="1701"/>
             <w:vAlign w:val="center"/>
             <w:shd w:fill="F2F2F2"/>
           </w:tcPr>
           <w:p>
             <w:pPr>
-              <w:jc w:val="center"/>
+              <w:spacing w:after="0" w:line="360" w:lineRule="auto"/>
+              <w:jc w:val="left"/>
             </w:pPr>
             <w:r/>
             <w:r>
@@ -218,7 +199,8 @@
           </w:tcPr>
           <w:p>
             <w:pPr>
-              <w:jc w:val="center"/>
+              <w:spacing w:after="0" w:line="360" w:lineRule="auto"/>
+              <w:jc w:val="left"/>
             </w:pPr>
             <w:r/>
             <w:r>
@@ -232,11 +214,149 @@
           </w:p>
         </w:tc>
       </w:tr>
+      <w:tr>
+        <w:trPr>
+          <w:trHeight w:val="539"/>
+        </w:trPr>
+        <w:tc>
+          <w:tcPr>
+            <w:tcW w:type="dxa" w:w="1701"/>
+            <w:vAlign w:val="center"/>
+            <w:shd w:fill="F2F2F2"/>
+          </w:tcPr>
+          <w:p>
+            <w:pPr>
+              <w:spacing w:after="0" w:line="360" w:lineRule="auto"/>
+              <w:jc w:val="left"/>
+            </w:pPr>
+            <w:r/>
+            <w:r>
+              <w:rPr>
+                <w:rFonts w:ascii="宋体" w:hAnsi="宋体" w:eastAsia="宋体"/>
+                <w:b/>
+                <w:sz w:val="24"/>
+              </w:rPr>
+              <w:t>教师</w:t>
+            </w:r>
+          </w:p>
+        </w:tc>
+        <w:tc>
+          <w:tcPr>
+            <w:tcW w:type="dxa" w:w="4819"/>
+            <w:vAlign w:val="center"/>
+          </w:tcPr>
+          <w:p>
+            <w:pPr>
+              <w:spacing w:after="0" w:line="360" w:lineRule="auto"/>
+              <w:jc w:val="left"/>
+            </w:pPr>
+            <w:r/>
+            <w:r>
+              <w:rPr>
+                <w:rFonts w:ascii="宋体" w:hAnsi="宋体" w:eastAsia="宋体"/>
+                <w:b w:val="0"/>
+                <w:sz w:val="24"/>
+              </w:rPr>
+              <w:t>成 卫</w:t>
+            </w:r>
+          </w:p>
+        </w:tc>
+      </w:tr>
+      <w:tr>
+        <w:trPr>
+          <w:trHeight w:val="539"/>
+        </w:trPr>
+        <w:tc>
+          <w:tcPr>
+            <w:tcW w:type="dxa" w:w="1701"/>
+            <w:vAlign w:val="center"/>
+          </w:tcPr>
+          <w:p>
+            <w:pPr>
+              <w:spacing w:after="0" w:line="360" w:lineRule="auto"/>
+              <w:jc w:val="left"/>
+            </w:pPr>
+            <w:r/>
+            <w:r>
+              <w:rPr>
+                <w:rFonts w:ascii="宋体" w:hAnsi="宋体" w:eastAsia="宋体"/>
+                <w:b w:val="0"/>
+                <w:sz w:val="24"/>
+              </w:rPr>
+            </w:r>
+          </w:p>
+        </w:tc>
+        <w:tc>
+          <w:tcPr>
+            <w:tcW w:type="dxa" w:w="4819"/>
+            <w:vAlign w:val="center"/>
+          </w:tcPr>
+          <w:p>
+            <w:pPr>
+              <w:spacing w:after="0" w:line="360" w:lineRule="auto"/>
+              <w:jc w:val="left"/>
+            </w:pPr>
+            <w:r/>
+            <w:r>
+              <w:rPr>
+                <w:rFonts w:ascii="宋体" w:hAnsi="宋体" w:eastAsia="宋体"/>
+                <w:b w:val="0"/>
+                <w:sz w:val="24"/>
+              </w:rPr>
+            </w:r>
+          </w:p>
+        </w:tc>
+      </w:tr>
+      <w:tr>
+        <w:trPr>
+          <w:trHeight w:val="539"/>
+        </w:trPr>
+        <w:tc>
+          <w:tcPr>
+            <w:tcW w:type="dxa" w:w="1701"/>
+            <w:vAlign w:val="center"/>
+          </w:tcPr>
+          <w:p>
+            <w:pPr>
+              <w:spacing w:after="0" w:line="360" w:lineRule="auto"/>
+              <w:jc w:val="left"/>
+            </w:pPr>
+            <w:r/>
+            <w:r>
+              <w:rPr>
+                <w:rFonts w:ascii="宋体" w:hAnsi="宋体" w:eastAsia="宋体"/>
+                <w:b/>
+                <w:sz w:val="24"/>
+              </w:rPr>
+              <w:t>日期</w:t>
+            </w:r>
+          </w:p>
+        </w:tc>
+        <w:tc>
+          <w:tcPr>
+            <w:tcW w:type="dxa" w:w="4819"/>
+            <w:vAlign w:val="center"/>
+          </w:tcPr>
+          <w:p>
+            <w:pPr>
+              <w:spacing w:after="0" w:line="360" w:lineRule="auto"/>
+              <w:jc w:val="left"/>
+            </w:pPr>
+            <w:r/>
+            <w:r>
+              <w:rPr>
+                <w:rFonts w:ascii="宋体" w:hAnsi="宋体" w:eastAsia="宋体"/>
+                <w:b w:val="0"/>
+                <w:sz w:val="24"/>
+              </w:rPr>
+              <w:t>2025年  月   日</w:t>
+            </w:r>
+          </w:p>
+        </w:tc>
+      </w:tr>
     </w:tbl>
     <w:p>
-      <w:r>
-        <w:br w:type="page"/>
-      </w:r>
+      <w:r/>
     </w:p>
     <w:p>
       <w:pPr>
@@ -249,7 +369,6 @@
           <w:b/>
           <w:sz w:val="32"/>
         </w:rPr>
-        <w:t>课程总结和心得</w:t>
       </w:r>
     </w:p>
     <w:p>
@@ -262,7 +381,6 @@
           <w:b/>
           <w:sz w:val="24"/>
         </w:rPr>
-        <w:t>一、对大数据技术的理解</w:t>
       </w:r>
     </w:p>
     <w:p>

</xml_diff>

<commit_message>
vault backup: 2026-05-06 21:11:26
</commit_message>
<xml_diff>
--- a/学校事务/大数据/课程总结/《大数据处理与实践》课程总结_提交版.docx
+++ b/学校事务/大数据/课程总结/《大数据处理与实践》课程总结_提交版.docx
@@ -2,22 +2,71 @@
 <file path=word/document.xml><?xml version="1.0" encoding="utf-8"?>
 <w:document xmlns:wpc="http://schemas.microsoft.com/office/word/2010/wordprocessingCanvas" xmlns:mo="http://schemas.microsoft.com/office/mac/office/2008/main" xmlns:mc="http://schemas.openxmlformats.org/markup-compatibility/2006" xmlns:mv="urn:schemas-microsoft-com:mac:vml" xmlns:o="urn:schemas-microsoft-com:office:office" xmlns:r="http://schemas.openxmlformats.org/officeDocument/2006/relationships" xmlns:m="http://schemas.openxmlformats.org/officeDocument/2006/math" xmlns:v="urn:schemas-microsoft-com:vml" xmlns:wp14="http://schemas.microsoft.com/office/word/2010/wordprocessingDrawing" xmlns:wp="http://schemas.openxmlformats.org/drawingml/2006/wordprocessingDrawing" xmlns:w10="urn:schemas-microsoft-com:office:word" xmlns:w="http://schemas.openxmlformats.org/wordprocessingml/2006/main" xmlns:w14="http://schemas.microsoft.com/office/word/2010/wordml" xmlns:wpg="http://schemas.microsoft.com/office/word/2010/wordprocessingGroup" xmlns:wpi="http://schemas.microsoft.com/office/word/2010/wordprocessingInk" xmlns:wne="http://schemas.microsoft.com/office/word/2006/wordml" xmlns:wps="http://schemas.microsoft.com/office/word/2010/wordprocessingShape" mc:Ignorable="w14 wp14">
   <w:body>
-    <w:p/>
-    <w:p/>
-    <w:p/>
-    <w:p/>
     <w:p>
       <w:pPr>
-        <w:spacing w:after="0"/>
-        <w:jc w:val="center"/>
+        <w:spacing w:line="360" w:lineRule="auto" w:before="0" w:after="0"/>
       </w:pPr>
       <w:r>
         <w:rPr>
           <w:rFonts w:ascii="宋体" w:hAnsi="宋体" w:eastAsia="宋体"/>
-          <w:b/>
-          <w:sz w:val="36"/>
+          <w:b w:val="0"/>
+          <w:sz w:val="24"/>
         </w:rPr>
       </w:r>
+    </w:p>
+    <w:p>
+      <w:pPr>
+        <w:spacing w:line="360" w:lineRule="auto" w:before="0" w:after="0"/>
+      </w:pPr>
+      <w:r>
+        <w:rPr>
+          <w:rFonts w:ascii="宋体" w:hAnsi="宋体" w:eastAsia="宋体"/>
+          <w:b w:val="0"/>
+          <w:sz w:val="24"/>
+        </w:rPr>
+      </w:r>
+    </w:p>
+    <w:p>
+      <w:pPr>
+        <w:spacing w:line="360" w:lineRule="auto" w:before="0" w:after="0"/>
+      </w:pPr>
+      <w:r>
+        <w:rPr>
+          <w:rFonts w:ascii="宋体" w:hAnsi="宋体" w:eastAsia="宋体"/>
+          <w:b w:val="0"/>
+          <w:sz w:val="24"/>
+        </w:rPr>
+      </w:r>
+    </w:p>
+    <w:p>
+      <w:pPr>
+        <w:spacing w:line="360" w:lineRule="auto" w:before="0" w:after="0"/>
+      </w:pPr>
+      <w:r>
+        <w:rPr>
+          <w:rFonts w:ascii="宋体" w:hAnsi="宋体" w:eastAsia="宋体"/>
+          <w:b w:val="0"/>
+          <w:sz w:val="24"/>
+        </w:rPr>
+      </w:r>
+    </w:p>
+    <w:p>
+      <w:pPr>
+        <w:spacing w:line="360" w:lineRule="auto" w:before="0" w:after="0"/>
+      </w:pPr>
+      <w:r>
+        <w:rPr>
+          <w:rFonts w:ascii="宋体" w:hAnsi="宋体" w:eastAsia="宋体"/>
+          <w:b w:val="0"/>
+          <w:sz w:val="24"/>
+        </w:rPr>
+      </w:r>
+    </w:p>
+    <w:p>
+      <w:pPr>
+        <w:spacing w:line="360" w:lineRule="auto" w:before="0" w:after="0"/>
+        <w:jc w:val="center"/>
+      </w:pPr>
       <w:r>
         <w:rPr>
           <w:rFonts w:ascii="宋体" w:hAnsi="宋体" w:eastAsia="宋体"/>
@@ -29,16 +78,9 @@
     </w:p>
     <w:p>
       <w:pPr>
-        <w:spacing w:after="0"/>
+        <w:spacing w:line="360" w:lineRule="auto" w:before="0" w:after="0"/>
         <w:jc w:val="center"/>
       </w:pPr>
-      <w:r>
-        <w:rPr>
-          <w:rFonts w:ascii="宋体" w:hAnsi="宋体" w:eastAsia="宋体"/>
-          <w:b/>
-          <w:sz w:val="44"/>
-        </w:rPr>
-      </w:r>
       <w:r>
         <w:rPr>
           <w:rFonts w:ascii="宋体" w:hAnsi="宋体" w:eastAsia="宋体"/>
@@ -48,12 +90,68 @@
         <w:t>课程总结</w:t>
       </w:r>
     </w:p>
-    <w:p/>
-    <w:p/>
-    <w:p/>
+    <w:p>
+      <w:pPr>
+        <w:spacing w:line="360" w:lineRule="auto" w:before="0" w:after="0"/>
+      </w:pPr>
+      <w:r>
+        <w:rPr>
+          <w:rFonts w:ascii="宋体" w:hAnsi="宋体" w:eastAsia="宋体"/>
+          <w:b w:val="0"/>
+          <w:sz w:val="24"/>
+        </w:rPr>
+      </w:r>
+    </w:p>
+    <w:p>
+      <w:pPr>
+        <w:spacing w:line="360" w:lineRule="auto" w:before="0" w:after="0"/>
+      </w:pPr>
+      <w:r>
+        <w:rPr>
+          <w:rFonts w:ascii="宋体" w:hAnsi="宋体" w:eastAsia="宋体"/>
+          <w:b w:val="0"/>
+          <w:sz w:val="24"/>
+        </w:rPr>
+      </w:r>
+    </w:p>
+    <w:p>
+      <w:pPr>
+        <w:spacing w:line="360" w:lineRule="auto" w:before="0" w:after="0"/>
+      </w:pPr>
+      <w:r>
+        <w:rPr>
+          <w:rFonts w:ascii="宋体" w:hAnsi="宋体" w:eastAsia="宋体"/>
+          <w:b w:val="0"/>
+          <w:sz w:val="24"/>
+        </w:rPr>
+      </w:r>
+    </w:p>
+    <w:p>
+      <w:pPr>
+        <w:spacing w:line="360" w:lineRule="auto" w:before="0" w:after="0"/>
+      </w:pPr>
+      <w:r>
+        <w:rPr>
+          <w:rFonts w:ascii="宋体" w:hAnsi="宋体" w:eastAsia="宋体"/>
+          <w:b w:val="0"/>
+          <w:sz w:val="24"/>
+        </w:rPr>
+      </w:r>
+    </w:p>
+    <w:p>
+      <w:pPr>
+        <w:spacing w:line="360" w:lineRule="auto" w:before="0" w:after="0"/>
+      </w:pPr>
+      <w:r>
+        <w:rPr>
+          <w:rFonts w:ascii="宋体" w:hAnsi="宋体" w:eastAsia="宋体"/>
+          <w:b w:val="0"/>
+          <w:sz w:val="24"/>
+        </w:rPr>
+      </w:r>
+    </w:p>
     <w:tbl>
       <w:tblPr>
-        <w:tblStyle w:val="TableGrid"/>
         <w:tblW w:type="auto" w:w="0"/>
         <w:jc w:val="center"/>
         <w:tblLook w:firstColumn="1" w:firstRow="1" w:lastColumn="0" w:lastRow="0" w:noHBand="0" w:noVBand="1" w:val="04A0"/>
@@ -78,11 +176,10 @@
           <w:tcPr>
             <w:tcW w:type="dxa" w:w="1701"/>
             <w:vAlign w:val="center"/>
-            <w:shd w:fill="F2F2F2"/>
           </w:tcPr>
           <w:p>
             <w:pPr>
-              <w:spacing w:after="0" w:line="360" w:lineRule="auto"/>
+              <w:spacing w:line="360" w:lineRule="auto" w:after="0"/>
               <w:jc w:val="left"/>
             </w:pPr>
             <w:r/>
@@ -103,7 +200,7 @@
           </w:tcPr>
           <w:p>
             <w:pPr>
-              <w:spacing w:after="0" w:line="360" w:lineRule="auto"/>
+              <w:spacing w:line="360" w:lineRule="auto" w:after="0"/>
               <w:jc w:val="left"/>
             </w:pPr>
             <w:r/>
@@ -126,11 +223,10 @@
           <w:tcPr>
             <w:tcW w:type="dxa" w:w="1701"/>
             <w:vAlign w:val="center"/>
-            <w:shd w:fill="F2F2F2"/>
           </w:tcPr>
           <w:p>
             <w:pPr>
-              <w:spacing w:after="0" w:line="360" w:lineRule="auto"/>
+              <w:spacing w:line="360" w:lineRule="auto" w:after="0"/>
               <w:jc w:val="left"/>
             </w:pPr>
             <w:r/>
@@ -151,7 +247,7 @@
           </w:tcPr>
           <w:p>
             <w:pPr>
-              <w:spacing w:after="0" w:line="360" w:lineRule="auto"/>
+              <w:spacing w:line="360" w:lineRule="auto" w:after="0"/>
               <w:jc w:val="left"/>
             </w:pPr>
             <w:r/>
@@ -174,11 +270,10 @@
           <w:tcPr>
             <w:tcW w:type="dxa" w:w="1701"/>
             <w:vAlign w:val="center"/>
-            <w:shd w:fill="F2F2F2"/>
           </w:tcPr>
           <w:p>
             <w:pPr>
-              <w:spacing w:after="0" w:line="360" w:lineRule="auto"/>
+              <w:spacing w:line="360" w:lineRule="auto" w:after="0"/>
               <w:jc w:val="left"/>
             </w:pPr>
             <w:r/>
@@ -199,7 +294,7 @@
           </w:tcPr>
           <w:p>
             <w:pPr>
-              <w:spacing w:after="0" w:line="360" w:lineRule="auto"/>
+              <w:spacing w:line="360" w:lineRule="auto" w:after="0"/>
               <w:jc w:val="left"/>
             </w:pPr>
             <w:r/>
@@ -222,11 +317,10 @@
           <w:tcPr>
             <w:tcW w:type="dxa" w:w="1701"/>
             <w:vAlign w:val="center"/>
-            <w:shd w:fill="F2F2F2"/>
           </w:tcPr>
           <w:p>
             <w:pPr>
-              <w:spacing w:after="0" w:line="360" w:lineRule="auto"/>
+              <w:spacing w:line="360" w:lineRule="auto" w:after="0"/>
               <w:jc w:val="left"/>
             </w:pPr>
             <w:r/>
@@ -247,7 +341,7 @@
           </w:tcPr>
           <w:p>
             <w:pPr>
-              <w:spacing w:after="0" w:line="360" w:lineRule="auto"/>
+              <w:spacing w:line="360" w:lineRule="auto" w:after="0"/>
               <w:jc w:val="left"/>
             </w:pPr>
             <w:r/>
@@ -273,7 +367,7 @@
           </w:tcPr>
           <w:p>
             <w:pPr>
-              <w:spacing w:after="0" w:line="360" w:lineRule="auto"/>
+              <w:spacing w:line="360" w:lineRule="auto" w:after="0"/>
               <w:jc w:val="left"/>
             </w:pPr>
             <w:r/>
@@ -293,7 +387,7 @@
           </w:tcPr>
           <w:p>
             <w:pPr>
-              <w:spacing w:after="0" w:line="360" w:lineRule="auto"/>
+              <w:spacing w:line="360" w:lineRule="auto" w:after="0"/>
               <w:jc w:val="left"/>
             </w:pPr>
             <w:r/>
@@ -318,7 +412,7 @@
           </w:tcPr>
           <w:p>
             <w:pPr>
-              <w:spacing w:after="0" w:line="360" w:lineRule="auto"/>
+              <w:spacing w:line="360" w:lineRule="auto" w:after="0"/>
               <w:jc w:val="left"/>
             </w:pPr>
             <w:r/>
@@ -339,7 +433,7 @@
           </w:tcPr>
           <w:p>
             <w:pPr>
-              <w:spacing w:after="0" w:line="360" w:lineRule="auto"/>
+              <w:spacing w:line="360" w:lineRule="auto" w:after="0"/>
               <w:jc w:val="left"/>
             </w:pPr>
             <w:r/>
@@ -356,11 +450,13 @@
       </w:tr>
     </w:tbl>
     <w:p>
-      <w:r/>
+      <w:r>
+        <w:br w:type="page"/>
+      </w:r>
     </w:p>
     <w:p>
       <w:pPr>
-        <w:spacing w:after="240"/>
+        <w:spacing w:line="360" w:lineRule="auto" w:before="0" w:after="160"/>
         <w:jc w:val="center"/>
       </w:pPr>
       <w:r>
@@ -369,6 +465,7 @@
           <w:b/>
           <w:sz w:val="32"/>
         </w:rPr>
+        <w:t>课程总结和心得</w:t>
       </w:r>
     </w:p>
     <w:p>
@@ -381,11 +478,12 @@
           <w:b/>
           <w:sz w:val="24"/>
         </w:rPr>
+        <w:t>一、对大数据技术的理解</w:t>
       </w:r>
     </w:p>
     <w:p>
       <w:pPr>
-        <w:spacing w:line="360" w:lineRule="auto" w:after="0"/>
+        <w:spacing w:line="360" w:lineRule="auto" w:before="0" w:after="0"/>
         <w:ind w:firstLine="480"/>
       </w:pPr>
       <w:r>
@@ -399,7 +497,7 @@
     </w:p>
     <w:p>
       <w:pPr>
-        <w:spacing w:line="360" w:lineRule="auto" w:after="0"/>
+        <w:spacing w:line="360" w:lineRule="auto" w:before="0" w:after="0"/>
         <w:ind w:firstLine="480"/>
       </w:pPr>
       <w:r>
@@ -413,7 +511,7 @@
     </w:p>
     <w:p>
       <w:pPr>
-        <w:spacing w:line="360" w:lineRule="auto" w:after="0"/>
+        <w:spacing w:line="360" w:lineRule="auto" w:before="0" w:after="0"/>
         <w:ind w:firstLine="480"/>
       </w:pPr>
       <w:r>
@@ -440,7 +538,7 @@
     </w:p>
     <w:p>
       <w:pPr>
-        <w:spacing w:line="360" w:lineRule="auto" w:after="0"/>
+        <w:spacing w:line="360" w:lineRule="auto" w:before="0" w:after="0"/>
         <w:ind w:firstLine="480"/>
       </w:pPr>
       <w:r>
@@ -454,7 +552,7 @@
     </w:p>
     <w:p>
       <w:pPr>
-        <w:spacing w:line="360" w:lineRule="auto" w:after="0"/>
+        <w:spacing w:line="360" w:lineRule="auto" w:before="0" w:after="0"/>
         <w:ind w:firstLine="480"/>
       </w:pPr>
       <w:r>
@@ -468,7 +566,7 @@
     </w:p>
     <w:p>
       <w:pPr>
-        <w:spacing w:line="360" w:lineRule="auto" w:after="0"/>
+        <w:spacing w:line="360" w:lineRule="auto" w:before="0" w:after="0"/>
         <w:ind w:firstLine="480"/>
       </w:pPr>
       <w:r>
@@ -495,7 +593,7 @@
     </w:p>
     <w:p>
       <w:pPr>
-        <w:spacing w:line="360" w:lineRule="auto" w:after="0"/>
+        <w:spacing w:line="360" w:lineRule="auto" w:before="0" w:after="0"/>
         <w:ind w:firstLine="480"/>
       </w:pPr>
       <w:r>
@@ -509,7 +607,7 @@
     </w:p>
     <w:p>
       <w:pPr>
-        <w:spacing w:line="360" w:lineRule="auto" w:after="0"/>
+        <w:spacing w:line="360" w:lineRule="auto" w:before="0" w:after="0"/>
         <w:ind w:firstLine="480"/>
       </w:pPr>
       <w:r>
@@ -523,7 +621,7 @@
     </w:p>
     <w:p>
       <w:pPr>
-        <w:spacing w:line="360" w:lineRule="auto" w:after="0"/>
+        <w:spacing w:line="360" w:lineRule="auto" w:before="0" w:after="0"/>
         <w:ind w:firstLine="480"/>
       </w:pPr>
       <w:r>
@@ -537,7 +635,7 @@
     </w:p>
     <w:p>
       <w:pPr>
-        <w:spacing w:line="360" w:lineRule="auto" w:after="0"/>
+        <w:spacing w:line="360" w:lineRule="auto" w:before="0" w:after="0"/>
         <w:ind w:firstLine="480"/>
       </w:pPr>
       <w:r>
@@ -551,7 +649,7 @@
     </w:p>
     <w:p>
       <w:pPr>
-        <w:spacing w:line="360" w:lineRule="auto" w:after="0"/>
+        <w:spacing w:line="360" w:lineRule="auto" w:before="0" w:after="0"/>
         <w:ind w:firstLine="480"/>
       </w:pPr>
       <w:r>

</xml_diff>

<commit_message>
vault backup: 2026-05-06 21:21:12
</commit_message>
<xml_diff>
--- a/学校事务/大数据/课程总结/《大数据处理与实践》课程总结_提交版.docx
+++ b/学校事务/大数据/课程总结/《大数据处理与实践》课程总结_提交版.docx
@@ -246,18 +246,8 @@
             <w:vAlign w:val="center"/>
           </w:tcPr>
           <w:p>
-            <w:pPr>
-              <w:spacing w:line="360" w:lineRule="auto" w:after="0"/>
-              <w:jc w:val="left"/>
-            </w:pPr>
-            <w:r/>
             <w:r>
-              <w:rPr>
-                <w:rFonts w:ascii="宋体" w:hAnsi="宋体" w:eastAsia="宋体"/>
-                <w:b w:val="0"/>
-                <w:sz w:val="24"/>
-              </w:rPr>
-              <w:t>【请填写学号】</w:t>
+              <w:t>12303070250</w:t>
             </w:r>
           </w:p>
         </w:tc>
@@ -293,18 +283,8 @@
             <w:vAlign w:val="center"/>
           </w:tcPr>
           <w:p>
-            <w:pPr>
-              <w:spacing w:line="360" w:lineRule="auto" w:after="0"/>
-              <w:jc w:val="left"/>
-            </w:pPr>
-            <w:r/>
             <w:r>
-              <w:rPr>
-                <w:rFonts w:ascii="宋体" w:hAnsi="宋体" w:eastAsia="宋体"/>
-                <w:b w:val="0"/>
-                <w:sz w:val="24"/>
-              </w:rPr>
-              <w:t>【请填写姓名】</w:t>
+              <w:t>黄彬</w:t>
             </w:r>
           </w:p>
         </w:tc>

</xml_diff>